<commit_message>
Fix BPMN structure: explicit merge gateways, missing end event; rebuild docx/pdf
bpmnlint:recommended now reports no issues on the three final diagrams.

Co-Authored-By: Claude Sonnet 5.5 <noreply@anthropic.com>
Claude-Session: https://claude.ai/code/session_01SJc26jBBW1uDSYSrNjHaJt
</commit_message>
<xml_diff>
--- a/aeroflot_registration_bpmn.docx
+++ b/aeroflot_registration_bpmn.docx
@@ -1334,7 +1334,7 @@
       <w:r>
         <w:drawing>
           <wp:inline distT="0" distB="0" distL="0" distR="0">
-            <wp:extent cx="8858250" cy="5391150"/>
+            <wp:extent cx="8858250" cy="5133975"/>
             <wp:effectExtent t="0" r="0" b="0" l="0"/>
             <wp:docPr id="1" name="Основная BPMN-диаграмма регистрации" descr="Основная BPMN-диаграмма регистрации" title="Основная BPMN-диаграмма регистрации"/>
             <wp:cNvGraphicFramePr>
@@ -1359,7 +1359,7 @@
                   <pic:spPr bwMode="auto">
                     <a:xfrm>
                       <a:off x="0" y="0"/>
-                      <a:ext cx="8858250" cy="5391150"/>
+                      <a:ext cx="8858250" cy="5133975"/>
                     </a:xfrm>
                     <a:prstGeom prst="rect">
                       <a:avLst/>
@@ -1436,7 +1436,7 @@
       <w:r>
         <w:drawing>
           <wp:inline distT="0" distB="0" distL="0" distR="0">
-            <wp:extent cx="5715000" cy="2162175"/>
+            <wp:extent cx="5715000" cy="2286000"/>
             <wp:effectExtent t="0" r="0" b="0" l="0"/>
             <wp:docPr id="1" name="Проверка полей" descr="Проверка полей" title="Проверка полей"/>
             <wp:cNvGraphicFramePr>
@@ -1461,7 +1461,7 @@
                   <pic:spPr bwMode="auto">
                     <a:xfrm>
                       <a:off x="0" y="0"/>
-                      <a:ext cx="5715000" cy="2162175"/>
+                      <a:ext cx="5715000" cy="2286000"/>
                     </a:xfrm>
                     <a:prstGeom prst="rect">
                       <a:avLst/>
@@ -1511,7 +1511,7 @@
       <w:r>
         <w:drawing>
           <wp:inline distT="0" distB="0" distL="0" distR="0">
-            <wp:extent cx="5715000" cy="2667000"/>
+            <wp:extent cx="5715000" cy="2781300"/>
             <wp:effectExtent t="0" r="0" b="0" l="0"/>
             <wp:docPr id="1" name="Обработка согласий" descr="Обработка согласий" title="Обработка согласий"/>
             <wp:cNvGraphicFramePr>
@@ -1536,7 +1536,7 @@
                   <pic:spPr bwMode="auto">
                     <a:xfrm>
                       <a:off x="0" y="0"/>
-                      <a:ext cx="5715000" cy="2667000"/>
+                      <a:ext cx="5715000" cy="2781300"/>
                     </a:xfrm>
                     <a:prstGeom prst="rect">
                       <a:avLst/>

</xml_diff>